<commit_message>
A1 Todo List - Part 2 styling and animations
</commit_message>
<xml_diff>
--- a/A1-Todo-List_DC/readme.docx
+++ b/A1-Todo-List_DC/readme.docx
@@ -18,7 +18,7 @@
     </w:p>
     <w:p>
       <w:r>
-        <w:t>[Your answer here]</w:t>
+        <w:t>Danie Corpuz | dcorpuz1@uci.edu</w:t>
       </w:r>
     </w:p>
     <w:p>
@@ -48,8 +48,23 @@
       </w:r>
     </w:p>
     <w:p>
-      <w:r>
-        <w:t>[Your answer here]</w:t>
+      <w:pPr>
+        <w:ind w:left="720" w:firstLine="0"/>
+      </w:pPr>
+      <w:r>
+        <w:t>I added two CSS animations. For completed tasks, clicking the check button fades the</w:t>
+      </w:r>
+      <w:r>
+        <w:t xml:space="preserve"> </w:t>
+      </w:r>
+      <w:r>
+        <w:t>entire row to reduced opacity and applies a strikethrough to the task text using a smooth transition. For removed tasks, clicking the trash icon triggers an animation that simultaneously fades the item out, collapses its height to zero, and slides it to the right</w:t>
+      </w:r>
+      <w:r>
+        <w:t xml:space="preserve"> which causes</w:t>
+      </w:r>
+      <w:r>
+        <w:t xml:space="preserve"> the tasks below to smoothly slide upward to fill the empty space.</w:t>
       </w:r>
     </w:p>
     <w:p>
@@ -79,8 +94,17 @@
       </w:r>
     </w:p>
     <w:p>
-      <w:r>
-        <w:t>[Your answer here]</w:t>
+      <w:pPr>
+        <w:ind w:left="720" w:firstLine="0"/>
+      </w:pPr>
+      <w:r>
+        <w:t>The most challenging part was getting the remove animation to work correctly so that</w:t>
+      </w:r>
+      <w:r>
+        <w:t xml:space="preserve"> </w:t>
+      </w:r>
+      <w:r>
+        <w:t>tasks below would slide up naturally.</w:t>
       </w:r>
     </w:p>
     <w:p>
@@ -99,7 +123,10 @@
     </w:p>
     <w:p>
       <w:r>
-        <w:t>[Your answer here]</w:t>
+        <w:t>The design follows a retro cassette tape aesthetic with a warm cream background, orange and teal accents, and a pixel display font.</w:t>
+      </w:r>
+      <w:r>
+        <w:t xml:space="preserve"> No further setup is needed. All fonts used are from Google Fonts. </w:t>
       </w:r>
     </w:p>
     <w:p>
@@ -117,8 +144,26 @@
       </w:r>
     </w:p>
     <w:p>
-      <w:r>
-        <w:t>[Your answer here]</w:t>
+      <w:pPr>
+        <w:ind w:left="720" w:firstLine="0"/>
+      </w:pPr>
+      <w:r>
+        <w:t>The assignment took a</w:t>
+      </w:r>
+      <w:r>
+        <w:t xml:space="preserve">bout two hours since </w:t>
+      </w:r>
+      <w:r>
+        <w:t>I had already planned out the design direction</w:t>
+      </w:r>
+      <w:r>
+        <w:t xml:space="preserve"> </w:t>
+      </w:r>
+      <w:r>
+        <w:t>I wanted</w:t>
+      </w:r>
+      <w:r>
+        <w:t xml:space="preserve"> after I created a simplified version of part 1. </w:t>
       </w:r>
     </w:p>
     <w:sectPr>

</xml_diff>